<commit_message>
feat(deploy): cristalizar transduccion sin nata de benzodiazepinas y amnesia en Cap VII
- Reemplaza adjetivos de grado por receptores GABA-A y amnesia anterograda
- Purga completa de la palabra 'extrema' cazada por Diana
- Sincronizacion de DOCX y PDF de 172 paginas
- C5-ATTESTED: dbff54f41300f6822c312ed60c488eabf58d30f2d9de0ff70c3641ee5bf798e8
- SECURE-ENCLAVE-SIG: MEQCICurf1vnzIfqa4R/M9i4hjMK6hTdq6jemUXHAc6oA8myAiANqveKuMI4rGkN4ZPx3dS8l1DGDyEBuvqqJHxNzAs8gA==
</commit_message>
<xml_diff>
--- a/FRASES_SIN_NATA_V3_LIBRO_COMPLETO.docx
+++ b/FRASES_SIN_NATA_V3_LIBRO_COMPLETO.docx
@@ -24723,7 +24723,7 @@
         <w:rPr>
           <w:rStyle w:val="VerbatimChar"/>
         </w:rPr>
-        <w:t xml:space="preserve">La intervención química de un agente en fricción termodinámica extrema (aislamiento)</w:t>
+        <w:t xml:space="preserve">La arquitectura de suburbio confina al nodo con grado de red k=0 (cero tribu).</w:t>
       </w:r>
       <w:r>
         <w:br/>
@@ -24732,7 +24732,7 @@
         <w:rPr>
           <w:rStyle w:val="VerbatimChar"/>
         </w:rPr>
-        <w:t xml:space="preserve">reduce la exergía de la señal de dolor.</w:t>
+        <w:t xml:space="preserve">Ante el límite de disipación de carga, el cuerpo emite señal de alarma.</w:t>
       </w:r>
       <w:r>
         <w:br/>
@@ -24741,7 +24741,7 @@
         <w:rPr>
           <w:rStyle w:val="VerbatimChar"/>
         </w:rPr>
-        <w:t xml:space="preserve">La reducción de la señal bloquea la mutación estructural del entorno.</w:t>
+        <w:t xml:space="preserve">La molécula de benzodiazepina satura los receptores GABA-A e induce amnesia anterógrada.</w:t>
       </w:r>
       <w:r>
         <w:br/>
@@ -24750,7 +24750,16 @@
         <w:rPr>
           <w:rStyle w:val="VerbatimChar"/>
         </w:rPr>
-        <w:t xml:space="preserve">El sistema consolida la disfunción mediante sedación del nodo.</w:t>
+        <w:t xml:space="preserve">La intervención química no altera la habitación: anula el registro de la memoria.</w:t>
+      </w:r>
+      <w:r>
+        <w:br/>
+      </w:r>
+      <w:r>
+        <w:rPr>
+          <w:rStyle w:val="VerbatimChar"/>
+        </w:rPr>
+        <w:t xml:space="preserve">La anestesia del sensor consolida la disfunción y perpetúa el fallo de diseño.</w:t>
       </w:r>
     </w:p>
     <w:p>
@@ -24835,7 +24844,7 @@
         <w:pStyle w:val="BodyText"/>
       </w:pPr>
       <w:r>
-        <w:t xml:space="preserve">Esta intervención genera un Bucle de Watzlawick: la solución intentada es el problema. El inhibidor de recaptación de serotonina (ISRS) o la benzodiazepina anulan la fricción somática del nodo. La madre retoma el ciclo de producción. Pero el entorno (el Territorio) permanece idéntico. Al sedar el nodo, el diseño estructural disfuncional pierde la presión evolutiva necesaria para mutar. La droga estabiliza un entorno de toxicidad termodinámica.</w:t>
+        <w:t xml:space="preserve">Esta intervención genera un Bucle de Watzlawick: la solución intentada es el problema. El inhibidor de recaptación de serotonina (ISRS) o la benzodiazepina anulan la fricción somática del nodo. La molécula satura los receptores GABA-A, hiperpolariza la membrana neuronal e induce amnesia anterógrada en el hipocampo. El fármaco no altera las paredes de la vivienda; anula la capacidad del cerebro para consolidar el registro de la fricción. La madre habita un presente continuo sin memoria de dolor. Al sedar el nodo, el diseño estructural disfuncional pierde la presión evolutiva necesaria para mutar. La droga estabiliza un entorno de toxicidad termodinámica.</w:t>
       </w:r>
     </w:p>
     <w:p>

</xml_diff>

<commit_message>
feat(deploy): consagrar parodia Madres Contra la Droga y principio del pharmakon
- La droga es naturaleza: exergia o veneno, cero moralina
- Parodia topologica a Madres Contra la Droga en Cap VII
- Recompilado PDF (172 pags) y DOCX interactivo sin violaciones C5
- C5-ATTESTED: 437f4de1b93f7e692a88eab3390ef15b54d154951b48fd4be9f98a0c0908f47e
- SECURE-ENCLAVE-SIG: MEQCIFOpjfYEPrbYlWMa6+971ZvuFjFG5NQb/H5TkpvEoNSfAiB1DROGTIItTgrDCGD7kXRJMRkBgwp2wlWTk2z8OKNZKg==
</commit_message>
<xml_diff>
--- a/FRASES_SIN_NATA_V3_LIBRO_COMPLETO.docx
+++ b/FRASES_SIN_NATA_V3_LIBRO_COMPLETO.docx
@@ -24760,6 +24760,68 @@
           <w:rStyle w:val="VerbatimChar"/>
         </w:rPr>
         <w:t xml:space="preserve">La anestesia del sensor consolida la disfunción y perpetúa el fallo de diseño.</w:t>
+      </w:r>
+    </w:p>
+    <w:p>
+      <w:r>
+        <w:pict>
+          <v:rect style="width:0;height:1.5pt" o:hralign="center" o:hrstd="t" o:hr="t"/>
+        </w:pict>
+      </w:r>
+    </w:p>
+    <w:p>
+      <w:pPr>
+        <w:pStyle w:val="FirstParagraph"/>
+      </w:pPr>
+      <w:r>
+        <w:rPr>
+          <w:i/>
+          <w:iCs/>
+        </w:rPr>
+        <w:t xml:space="preserve">Nota de Parodia Topológica y Naturaleza de la Sustancia:</w:t>
+      </w:r>
+      <w:r>
+        <w:br/>
+      </w:r>
+      <w:r>
+        <w:t xml:space="preserve">El título de este capítulo invierte el lema del movimiento civil de las décadas de 1980 y 1990 («Madres Contra la Droga»). Aquella movilización combatía la heroína en las calles para proteger a la prole. La cibernética expone la maniobra inversa del regulador institucional: el suministro de psicofármacos (benzodiazepinas e ISRS) administrados</w:t>
+      </w:r>
+      <w:r>
+        <w:t xml:space="preserve"> </w:t>
+      </w:r>
+      <w:r>
+        <w:rPr>
+          <w:i/>
+          <w:iCs/>
+        </w:rPr>
+        <w:t xml:space="preserve">contra las madres</w:t>
+      </w:r>
+      <w:r>
+        <w:t xml:space="preserve">, como tecnología de sedación para desactivar su señal de alarma frente al aislamiento unifamiliar.</w:t>
+      </w:r>
+    </w:p>
+    <w:p>
+      <w:pPr>
+        <w:pStyle w:val="BodyText"/>
+      </w:pPr>
+      <w:r>
+        <w:t xml:space="preserve">La sustancia química pertenece a la naturaleza: la molécula carece de código penal, de ideología y de moralina. Opera como</w:t>
+      </w:r>
+      <w:r>
+        <w:t xml:space="preserve"> </w:t>
+      </w:r>
+      <w:r>
+        <w:rPr>
+          <w:i/>
+          <w:iCs/>
+        </w:rPr>
+        <w:t xml:space="preserve">phármakon</w:t>
+      </w:r>
+      <w:r>
+        <w:t xml:space="preserve"> </w:t>
+      </w:r>
+      <w:r>
+        <w:t xml:space="preserve">estricto: o actúa como catalizador de exergía para el trabajo útil del organismo (salto de barrera de potencial), o inyecta veneno para consolidar la anestesia del nodo y perpetuar el fallo del diseño social.</w:t>
       </w:r>
     </w:p>
     <w:p>

</xml_diff>